<commit_message>
Client Web 31 Jan v3
</commit_message>
<xml_diff>
--- a/Euree_Balanced/temp/Euree_Balanced-Monthly-2026-2-20-Body.docx
+++ b/Euree_Balanced/temp/Euree_Balanced-Monthly-2026-2-20-Body.docx
@@ -1554,7 +1554,7 @@
           </w:tcPr>
           <w:p>
             <w:r>
-              <w:t>9.71</w:t>
+              <w:t>10.69</w:t>
             </w:r>
           </w:p>
         </w:tc>
@@ -1586,7 +1586,7 @@
           </w:tcPr>
           <w:p>
             <w:r>
-              <w:t>9.56</w:t>
+              <w:t>8.47</w:t>
             </w:r>
           </w:p>
         </w:tc>
@@ -1627,7 +1627,7 @@
               <w:rPr>
                 <w:b/>
               </w:rPr>
-              <w:t>9.72</w:t>
+              <w:t>10.67</w:t>
             </w:r>
           </w:p>
         </w:tc>
@@ -1659,7 +1659,7 @@
           </w:tcPr>
           <w:p>
             <w:r>
-              <w:t>20.29</w:t>
+              <w:t>14.04</w:t>
             </w:r>
           </w:p>
         </w:tc>
@@ -1691,7 +1691,7 @@
           </w:tcPr>
           <w:p>
             <w:r>
-              <w:t>19.0</w:t>
+              <w:t>16.51</w:t>
             </w:r>
           </w:p>
         </w:tc>
@@ -1723,7 +1723,7 @@
           </w:tcPr>
           <w:p>
             <w:r>
-              <w:t>17.15</w:t>
+              <w:t>12.57</w:t>
             </w:r>
           </w:p>
         </w:tc>
@@ -1755,7 +1755,7 @@
           </w:tcPr>
           <w:p>
             <w:r>
-              <w:t>16.27</w:t>
+              <w:t>13.97</w:t>
             </w:r>
           </w:p>
         </w:tc>
@@ -1787,7 +1787,7 @@
           </w:tcPr>
           <w:p>
             <w:r>
-              <w:t>9.39</w:t>
+              <w:t>8.99</w:t>
             </w:r>
           </w:p>
         </w:tc>
@@ -1819,7 +1819,7 @@
           </w:tcPr>
           <w:p>
             <w:r>
-              <w:t>18.59</w:t>
+              <w:t>12.74</w:t>
             </w:r>
           </w:p>
         </w:tc>
@@ -1851,7 +1851,7 @@
           </w:tcPr>
           <w:p>
             <w:r>
-              <w:t>14.4</w:t>
+              <w:t>11.3</w:t>
             </w:r>
           </w:p>
         </w:tc>
@@ -1883,7 +1883,7 @@
           </w:tcPr>
           <w:p>
             <w:r>
-              <w:t>21.72</w:t>
+              <w:t>12.77</w:t>
             </w:r>
           </w:p>
         </w:tc>
@@ -1915,7 +1915,7 @@
           </w:tcPr>
           <w:p>
             <w:r>
-              <w:t>16.48</w:t>
+              <w:t>12.77</w:t>
             </w:r>
           </w:p>
         </w:tc>
@@ -1956,7 +1956,7 @@
               <w:rPr>
                 <w:b/>
               </w:rPr>
-              <w:t>19.24</w:t>
+              <w:t>13.91</w:t>
             </w:r>
           </w:p>
         </w:tc>
@@ -1988,7 +1988,7 @@
           </w:tcPr>
           <w:p>
             <w:r>
-              <w:t>10.04</w:t>
+              <w:t>10.8</w:t>
             </w:r>
           </w:p>
         </w:tc>
@@ -2020,7 +2020,7 @@
           </w:tcPr>
           <w:p>
             <w:r>
-              <w:t>8.13</w:t>
+              <w:t>10.31</w:t>
             </w:r>
           </w:p>
         </w:tc>
@@ -2052,7 +2052,7 @@
           </w:tcPr>
           <w:p>
             <w:r>
-              <w:t>9.93</w:t>
+              <w:t>10.6</w:t>
             </w:r>
           </w:p>
         </w:tc>
@@ -2084,7 +2084,7 @@
           </w:tcPr>
           <w:p>
             <w:r>
-              <w:t>9.7</w:t>
+              <w:t>9.77</w:t>
             </w:r>
           </w:p>
         </w:tc>
@@ -2125,7 +2125,7 @@
               <w:rPr>
                 <w:b/>
               </w:rPr>
-              <w:t>5.42</w:t>
+              <w:t>7.34</w:t>
             </w:r>
           </w:p>
         </w:tc>
@@ -2157,7 +2157,7 @@
           </w:tcPr>
           <w:p>
             <w:r>
-              <w:t>39.04</w:t>
+              <w:t>35.53</w:t>
             </w:r>
           </w:p>
         </w:tc>
@@ -2189,7 +2189,7 @@
           </w:tcPr>
           <w:p>
             <w:r>
-              <w:t>4.55</w:t>
+              <w:t>3.64</w:t>
             </w:r>
           </w:p>
         </w:tc>
@@ -2221,7 +2221,7 @@
           </w:tcPr>
           <w:p>
             <w:r>
-              <w:t>10.13</w:t>
+              <w:t>8.22</w:t>
             </w:r>
           </w:p>
         </w:tc>
@@ -2262,7 +2262,7 @@
               <w:rPr>
                 <w:b/>
               </w:rPr>
-              <w:t>4.21</w:t>
+              <w:t>3.49</w:t>
             </w:r>
           </w:p>
         </w:tc>
@@ -2294,7 +2294,7 @@
           </w:tcPr>
           <w:p>
             <w:r>
-              <w:t>2.76</w:t>
+              <w:t>3.16</w:t>
             </w:r>
           </w:p>
         </w:tc>
@@ -2326,7 +2326,7 @@
           </w:tcPr>
           <w:p>
             <w:r>
-              <w:t>2.9</w:t>
+              <w:t>3.65</w:t>
             </w:r>
           </w:p>
         </w:tc>
@@ -2358,7 +2358,7 @@
           </w:tcPr>
           <w:p>
             <w:r>
-              <w:t>2.59</w:t>
+              <w:t>3.2</w:t>
             </w:r>
           </w:p>
         </w:tc>
@@ -2390,7 +2390,7 @@
           </w:tcPr>
           <w:p>
             <w:r>
-              <w:t>2.06</w:t>
+              <w:t>2.46</w:t>
             </w:r>
           </w:p>
         </w:tc>
@@ -2431,7 +2431,7 @@
               <w:rPr>
                 <w:b/>
               </w:rPr>
-              <w:t>2.96</w:t>
+              <w:t>3.47</w:t>
             </w:r>
           </w:p>
         </w:tc>
@@ -2463,7 +2463,7 @@
           </w:tcPr>
           <w:p>
             <w:r>
-              <w:t>5.73</w:t>
+              <w:t>4.82</w:t>
             </w:r>
           </w:p>
         </w:tc>
@@ -2504,7 +2504,7 @@
               <w:rPr>
                 <w:b/>
               </w:rPr>
-              <w:t>5.15</w:t>
+              <w:t>4.25</w:t>
             </w:r>
           </w:p>
         </w:tc>
@@ -2536,7 +2536,7 @@
           </w:tcPr>
           <w:p>
             <w:r>
-              <w:t>4.19</w:t>
+              <w:t>3.48</w:t>
             </w:r>
           </w:p>
         </w:tc>

</xml_diff>